<commit_message>
Reduce image DPI to decrease report file size below 2MB limit
</commit_message>
<xml_diff>
--- a/report/Clustering_Report.docx
+++ b/report/Clustering_Report.docx
@@ -743,7 +743,7 @@
       <w:r>
         <w:drawing>
           <wp:inline xmlns:a="http://schemas.openxmlformats.org/drawingml/2006/main" xmlns:pic="http://schemas.openxmlformats.org/drawingml/2006/picture">
-            <wp:extent cx="5486400" cy="5384114"/>
+            <wp:extent cx="5486400" cy="5383530"/>
             <wp:docPr id="10" name="Picture 10"/>
             <wp:cNvGraphicFramePr>
               <a:graphicFrameLocks noChangeAspect="1"/>
@@ -764,7 +764,7 @@
                   <pic:spPr>
                     <a:xfrm>
                       <a:off x="0" y="0"/>
-                      <a:ext cx="5486400" cy="5384114"/>
+                      <a:ext cx="5486400" cy="5383530"/>
                     </a:xfrm>
                     <a:prstGeom prst="rect"/>
                   </pic:spPr>

</xml_diff>